<commit_message>
Deploy stakeholder feedback release
</commit_message>
<xml_diff>
--- a/ICEbreaker-Stakeholder-Review-Guide.docx
+++ b/ICEbreaker-Stakeholder-Review-Guide.docx
@@ -196,7 +196,7 @@
                 <w:color w:val="2F6F21"/>
                 <w:sz w:val="22"/>
               </w:rPr>
-              <w:t>Validate whether ICEbreaker makes control ownership, procedure guidance, execution, escalation and reporting clear enough for a practical pilot.</w:t>
+              <w:t>Validate whether ICEbreaker makes ownership, recurring attestation, procedure guidance, execution exceptions and Controller reporting clear enough for a practical pilot.</w:t>
             </w:r>
           </w:p>
         </w:tc>
@@ -271,7 +271,7 @@
           <w:color w:val="3C3C3C"/>
           <w:sz w:val="22"/>
         </w:rPr>
-        <w:t>Start on Control tower. Review the headline metrics, prioritized exceptions and certification-period selector.</w:t>
+        <w:t>Start on Control tower. Switch among the control-pillar tabs, scan the detailed workflow stages and exceptions, and note the active certification period.</w:t>
       </w:r>
     </w:p>
     <w:p>
@@ -298,7 +298,7 @@
           <w:color w:val="3C3C3C"/>
           <w:sz w:val="22"/>
         </w:rPr>
-        <w:t>Open INV.MF.01 or another inventory control. Confirm the owner, site, due date, evidence rule and execution instructions are understandable.</w:t>
+        <w:t>Open INV.MF.01 or another inventory control. Confirm the owner, site, due date, attestation frequency, explicit evidence requirement and lifecycle are understandable. Evidence should remain Not scoped until a Controller or upload sets it.</w:t>
       </w:r>
     </w:p>
     <w:p>
@@ -325,7 +325,7 @@
           <w:color w:val="3C3C3C"/>
           <w:sz w:val="22"/>
         </w:rPr>
-        <w:t>In Desktop procedure, add numbered working steps, enter version/owner/review dates, attach a sample procedure if desired, then save the DTP guidance.</w:t>
+        <w:t>In Desktop procedure, add numbered working steps, enter version, procedure owner and review dates, then attach a sample file or paste a SharePoint-style reference. Save a draft and confirm the procedure current.</w:t>
       </w:r>
     </w:p>
     <w:p>
@@ -342,7 +342,7 @@
           <w:color w:val="0000A0"/>
           <w:sz w:val="22"/>
         </w:rPr>
-        <w:t xml:space="preserve">Test escalation. </w:t>
+        <w:t xml:space="preserve">Test exception visibility. </w:t>
       </w:r>
       <w:r>
         <w:rPr>
@@ -352,7 +352,7 @@
           <w:color w:val="3C3C3C"/>
           <w:sz w:val="22"/>
         </w:rPr>
-        <w:t>Use Ask for guidance to submit a question. Use Log a gap to create an exception and verify that the form explains how the request will be routed and tracked.</w:t>
+        <w:t>Use Ask for guidance to submit a question. Record a performed-with-deviations outcome as the owner, save the draft, then confirm the deviation appears directly in the Controller drawer and reports. Gap remediation remains a lightweight test feature only.</w:t>
       </w:r>
     </w:p>
     <w:p>
@@ -379,7 +379,7 @@
           <w:color w:val="3C3C3C"/>
           <w:sz w:val="22"/>
         </w:rPr>
-        <w:t>Open Reports, switch among Leadership, Site owners and Controllers, apply filters, save a view and download the resulting control list.</w:t>
+        <w:t>Open Reports, switch among Leadership, Site owners and Controllers, apply and clear filters, save a view, and download the detailed control list. Check that owner drafts, evidence scope and reassignment requests are visible.</w:t>
       </w:r>
     </w:p>
     <w:p>
@@ -406,7 +406,34 @@
           <w:color w:val="3C3C3C"/>
           <w:sz w:val="22"/>
         </w:rPr>
-        <w:t>Assign a control to Demo Account, switch roles from the lower-left profile card, open My controls, confirm ownership and understanding, add evidence where required and certify.</w:t>
+        <w:t>Assign an active control to Demo Account, switch roles from the lower-left profile card and open My controls. Save ownership acceptance separately, request reassignment on one test control, save partial execution work as a draft, open and confirm the current DTP, add a file or evidence link, then certify an eligible control.</w:t>
+      </w:r>
+    </w:p>
+    <w:p>
+      <w:pPr>
+        <w:pStyle w:val="ListNumber"/>
+        <w:spacing w:after="140" w:line="300" w:lineRule="auto"/>
+        <w:ind w:left="720" w:hanging="360"/>
+      </w:pPr>
+      <w:r>
+        <w:rPr>
+          <w:rFonts w:ascii="Arial" w:hAnsi="Arial"/>
+          <w:b/>
+          <w:i w:val="0"/>
+          <w:color w:val="0000A0"/>
+          <w:sz w:val="22"/>
+        </w:rPr>
+        <w:t xml:space="preserve">Check permissions and retained history. </w:t>
+      </w:r>
+      <w:r>
+        <w:rPr>
+          <w:rFonts w:ascii="Arial" w:hAnsi="Arial"/>
+          <w:b w:val="0"/>
+          <w:i w:val="0"/>
+          <w:color w:val="3C3C3C"/>
+          <w:sz w:val="22"/>
+        </w:rPr>
+        <w:t>From Controls library, open an unassigned control and confirm it is read-only for execution and evidence while its DTP remains readable. As Controller Admin, mark a test control Not applicable or Archived and confirm history is retained outside active queues.</w:t>
       </w:r>
     </w:p>
     <w:p>
@@ -434,11 +461,6 @@
           <w:sz w:val="22"/>
         </w:rPr>
         <w:t>Use the prompts on the next page to record what is clear, confusing, missing or unnecessarily complex.</w:t>
-      </w:r>
-    </w:p>
-    <w:p>
-      <w:r>
-        <w:br w:type="page"/>
       </w:r>
     </w:p>
     <w:p>
@@ -481,6 +503,23 @@
           <w:color w:val="3C3C3C"/>
           <w:sz w:val="22"/>
         </w:rPr>
+        <w:t>Cadence: Is the distinction between control frequency, attestation frequency and the active review period clear?</w:t>
+      </w:r>
+    </w:p>
+    <w:p>
+      <w:pPr>
+        <w:pStyle w:val="ListBullet"/>
+        <w:spacing w:after="80" w:line="300" w:lineRule="auto"/>
+        <w:ind w:left="720" w:hanging="360"/>
+      </w:pPr>
+      <w:r>
+        <w:rPr>
+          <w:rFonts w:ascii="Arial" w:hAnsi="Arial"/>
+          <w:b w:val="0"/>
+          <w:i w:val="0"/>
+          <w:color w:val="3C3C3C"/>
+          <w:sz w:val="22"/>
+        </w:rPr>
         <w:t>Procedure quality: Is the combination of execution instructions, DTP steps and attachments sufficient?</w:t>
       </w:r>
     </w:p>
@@ -498,7 +537,7 @@
           <w:color w:val="3C3C3C"/>
           <w:sz w:val="22"/>
         </w:rPr>
-        <w:t>Evidence: Is it obvious when evidence is mandatory, what to upload and what completion means?</w:t>
+        <w:t>Evidence: Is it obvious that the requirement must be explicitly scoped, who can see evidence and whether a file or governed link is acceptable?</w:t>
       </w:r>
     </w:p>
     <w:p>
@@ -515,7 +554,7 @@
           <w:color w:val="3C3C3C"/>
           <w:sz w:val="22"/>
         </w:rPr>
-        <w:t>Escalation: Are guidance requests and gaps distinct, and is the expected follow-up clear?</w:t>
+        <w:t>Workflow: Are acknowledgement, draft saving, execution and final certification clearly separate actions?</w:t>
       </w:r>
     </w:p>
     <w:p>
@@ -532,7 +571,24 @@
           <w:color w:val="3C3C3C"/>
           <w:sz w:val="22"/>
         </w:rPr>
-        <w:t>Reporting: Do the views and filters answer Controller, leadership and site-owner questions?</w:t>
+        <w:t>Escalation: Are guidance, reassignment and execution-deviation routes distinct, and is the expected follow-up clear?</w:t>
+      </w:r>
+    </w:p>
+    <w:p>
+      <w:pPr>
+        <w:pStyle w:val="ListBullet"/>
+        <w:spacing w:after="80" w:line="300" w:lineRule="auto"/>
+        <w:ind w:left="720" w:hanging="360"/>
+      </w:pPr>
+      <w:r>
+        <w:rPr>
+          <w:rFonts w:ascii="Arial" w:hAnsi="Arial"/>
+          <w:b w:val="0"/>
+          <w:i w:val="0"/>
+          <w:color w:val="3C3C3C"/>
+          <w:sz w:val="22"/>
+        </w:rPr>
+        <w:t>Reporting: Do pillar views, detailed stages, exceptions, saved filters and downloads answer Controller, leadership and site-owner questions?</w:t>
       </w:r>
     </w:p>
     <w:p>
@@ -683,7 +739,7 @@
                 <w:color w:val="3C3C3C"/>
                 <w:sz w:val="19"/>
               </w:rPr>
-              <w:t>Which fields are essential? Which feel redundant or unclear?</w:t>
+              <w:t>Are lifecycle, attestation cadence and evidence scope clear? Which other metadata is essential?</w:t>
             </w:r>
           </w:p>
         </w:tc>
@@ -735,7 +791,7 @@
                 <w:color w:val="3C3C3C"/>
                 <w:sz w:val="19"/>
               </w:rPr>
-              <w:t>Could you complete certification without separate training?</w:t>
+              <w:t>Are acknowledgement, partial draft and certification distinct enough? Are the readiness blockers useful?</w:t>
             </w:r>
           </w:p>
         </w:tc>
@@ -787,7 +843,7 @@
                 <w:color w:val="3C3C3C"/>
                 <w:sz w:val="19"/>
               </w:rPr>
-              <w:t>What minimum guidance and evidence should be required?</w:t>
+              <w:t>Who should maintain procedures? When should review be reconfirmed? Are file and SharePoint-link options sufficient?</w:t>
             </w:r>
           </w:p>
         </w:tc>
@@ -814,7 +870,7 @@
                 <w:color w:val="0000A0"/>
                 <w:sz w:val="19"/>
               </w:rPr>
-              <w:t>Requests &amp; gaps</w:t>
+              <w:t>Requests &amp; exceptions</w:t>
             </w:r>
           </w:p>
         </w:tc>
@@ -839,7 +895,7 @@
                 <w:color w:val="3C3C3C"/>
                 <w:sz w:val="19"/>
               </w:rPr>
-              <w:t>Is the distinction clear? Who should receive and resolve each item?</w:t>
+              <w:t>Are guidance, reassignment and deviation routes clear? Who should receive and resolve each item?</w:t>
             </w:r>
           </w:p>
         </w:tc>
@@ -891,59 +947,7 @@
                 <w:color w:val="3C3C3C"/>
                 <w:sz w:val="19"/>
               </w:rPr>
-              <w:t>Which audience views and filters would you use most often?</w:t>
-            </w:r>
-          </w:p>
-        </w:tc>
-      </w:tr>
-      <w:tr>
-        <w:tc>
-          <w:tcPr>
-            <w:tcW w:type="dxa" w:w="2350"/>
-            <w:shd w:fill="FFFFFF"/>
-            <w:tcMar>
-              <w:top w:w="100" w:type="dxa"/>
-              <w:start w:w="120" w:type="dxa"/>
-              <w:bottom w:w="100" w:type="dxa"/>
-              <w:end w:w="120" w:type="dxa"/>
-            </w:tcMar>
-            <w:vAlign w:val="center"/>
-          </w:tcPr>
-          <w:p>
-            <w:r>
-              <w:rPr>
-                <w:rFonts w:ascii="Arial" w:hAnsi="Arial"/>
-                <w:b/>
-                <w:i w:val="0"/>
-                <w:color w:val="0000A0"/>
-                <w:sz w:val="19"/>
-              </w:rPr>
-              <w:t>Pilot readiness</w:t>
-            </w:r>
-          </w:p>
-        </w:tc>
-        <w:tc>
-          <w:tcPr>
-            <w:tcW w:type="dxa" w:w="7010"/>
-            <w:shd w:fill="FFFFFF"/>
-            <w:tcMar>
-              <w:top w:w="100" w:type="dxa"/>
-              <w:start w:w="120" w:type="dxa"/>
-              <w:bottom w:w="100" w:type="dxa"/>
-              <w:end w:w="120" w:type="dxa"/>
-            </w:tcMar>
-            <w:vAlign w:val="center"/>
-          </w:tcPr>
-          <w:p>
-            <w:r>
-              <w:rPr>
-                <w:rFonts w:ascii="Arial" w:hAnsi="Arial"/>
-                <w:b w:val="0"/>
-                <w:i w:val="0"/>
-                <w:color w:val="3C3C3C"/>
-                <w:sz w:val="19"/>
-              </w:rPr>
-              <w:t>What must change before testing with Europe inventory users?</w:t>
+              <w:t>Which pillar, stage, exception, site and owner views would you use most often?</w:t>
             </w:r>
           </w:p>
         </w:tc>
@@ -1195,7 +1199,7 @@
                 <w:color w:val="3C3C3C"/>
                 <w:sz w:val="18"/>
               </w:rPr>
-              <w:t>Simulated in-app routing</w:t>
+              <w:t>On-screen reminder and email previews only</w:t>
             </w:r>
           </w:p>
         </w:tc>
@@ -1272,7 +1276,7 @@
                 <w:color w:val="3C3C3C"/>
                 <w:sz w:val="18"/>
               </w:rPr>
-              <w:t>Filename-level prototype behavior</w:t>
+              <w:t>Filename and reference-link prototype behavior</w:t>
             </w:r>
           </w:p>
         </w:tc>
@@ -1297,7 +1301,7 @@
                 <w:color w:val="3C3C3C"/>
                 <w:sz w:val="18"/>
               </w:rPr>
-              <w:t>Enterprise object storage and retention</w:t>
+              <w:t>Governed storage, SharePoint and retention</w:t>
             </w:r>
           </w:p>
         </w:tc>

</xml_diff>